<commit_message>
feat: input and test model
</commit_message>
<xml_diff>
--- a/Reporte Music Classification DeepLearning.docx
+++ b/Reporte Music Classification DeepLearning.docx
@@ -8,7 +8,15 @@
         <w:framePr w:w="0" w:hSpace="0" w:vSpace="0" w:wrap="auto" w:vAnchor="margin" w:hAnchor="text" w:xAlign="left" w:yAlign="inline"/>
       </w:pPr>
       <w:r>
-        <w:t>Deep Learning: clasificador de canciones</w:t>
+        <w:t xml:space="preserve">Deep </w:t>
+      </w:r>
+      <w:proofErr w:type="spellStart"/>
+      <w:r>
+        <w:t>Learning</w:t>
+      </w:r>
+      <w:proofErr w:type="spellEnd"/>
+      <w:r>
+        <w:t>: clasificador de canciones</w:t>
       </w:r>
     </w:p>
     <w:p>
@@ -199,6 +207,7 @@
           <w:szCs w:val="18"/>
         </w:rPr>
       </w:pPr>
+      <w:proofErr w:type="spellStart"/>
       <w:r>
         <w:rPr>
           <w:b/>
@@ -209,6 +218,7 @@
         </w:rPr>
         <w:t>Abstract</w:t>
       </w:r>
+      <w:proofErr w:type="spellEnd"/>
       <w:r>
         <w:rPr>
           <w:b/>
@@ -236,8 +246,9 @@
           <w:sz w:val="18"/>
           <w:szCs w:val="18"/>
         </w:rPr>
-        <w:t>Musical genre classification using advanced audio analysis and deep learning techniques</w:t>
-      </w:r>
+        <w:t xml:space="preserve">Musical </w:t>
+      </w:r>
+      <w:proofErr w:type="spellStart"/>
       <w:r>
         <w:rPr>
           <w:b/>
@@ -247,6 +258,186 @@
           <w:sz w:val="18"/>
           <w:szCs w:val="18"/>
         </w:rPr>
+        <w:t>genre</w:t>
+      </w:r>
+      <w:proofErr w:type="spellEnd"/>
+      <w:r>
+        <w:rPr>
+          <w:b/>
+          <w:i/>
+          <w:iCs/>
+          <w:color w:val="000000"/>
+          <w:sz w:val="18"/>
+          <w:szCs w:val="18"/>
+        </w:rPr>
+        <w:t xml:space="preserve"> </w:t>
+      </w:r>
+      <w:proofErr w:type="spellStart"/>
+      <w:r>
+        <w:rPr>
+          <w:b/>
+          <w:i/>
+          <w:iCs/>
+          <w:color w:val="000000"/>
+          <w:sz w:val="18"/>
+          <w:szCs w:val="18"/>
+        </w:rPr>
+        <w:t>classification</w:t>
+      </w:r>
+      <w:proofErr w:type="spellEnd"/>
+      <w:r>
+        <w:rPr>
+          <w:b/>
+          <w:i/>
+          <w:iCs/>
+          <w:color w:val="000000"/>
+          <w:sz w:val="18"/>
+          <w:szCs w:val="18"/>
+        </w:rPr>
+        <w:t xml:space="preserve"> </w:t>
+      </w:r>
+      <w:proofErr w:type="spellStart"/>
+      <w:r>
+        <w:rPr>
+          <w:b/>
+          <w:i/>
+          <w:iCs/>
+          <w:color w:val="000000"/>
+          <w:sz w:val="18"/>
+          <w:szCs w:val="18"/>
+        </w:rPr>
+        <w:t>using</w:t>
+      </w:r>
+      <w:proofErr w:type="spellEnd"/>
+      <w:r>
+        <w:rPr>
+          <w:b/>
+          <w:i/>
+          <w:iCs/>
+          <w:color w:val="000000"/>
+          <w:sz w:val="18"/>
+          <w:szCs w:val="18"/>
+        </w:rPr>
+        <w:t xml:space="preserve"> </w:t>
+      </w:r>
+      <w:proofErr w:type="spellStart"/>
+      <w:r>
+        <w:rPr>
+          <w:b/>
+          <w:i/>
+          <w:iCs/>
+          <w:color w:val="000000"/>
+          <w:sz w:val="18"/>
+          <w:szCs w:val="18"/>
+        </w:rPr>
+        <w:t>advanced</w:t>
+      </w:r>
+      <w:proofErr w:type="spellEnd"/>
+      <w:r>
+        <w:rPr>
+          <w:b/>
+          <w:i/>
+          <w:iCs/>
+          <w:color w:val="000000"/>
+          <w:sz w:val="18"/>
+          <w:szCs w:val="18"/>
+        </w:rPr>
+        <w:t xml:space="preserve"> audio </w:t>
+      </w:r>
+      <w:proofErr w:type="spellStart"/>
+      <w:r>
+        <w:rPr>
+          <w:b/>
+          <w:i/>
+          <w:iCs/>
+          <w:color w:val="000000"/>
+          <w:sz w:val="18"/>
+          <w:szCs w:val="18"/>
+        </w:rPr>
+        <w:t>analysis</w:t>
+      </w:r>
+      <w:proofErr w:type="spellEnd"/>
+      <w:r>
+        <w:rPr>
+          <w:b/>
+          <w:i/>
+          <w:iCs/>
+          <w:color w:val="000000"/>
+          <w:sz w:val="18"/>
+          <w:szCs w:val="18"/>
+        </w:rPr>
+        <w:t xml:space="preserve"> and </w:t>
+      </w:r>
+      <w:proofErr w:type="spellStart"/>
+      <w:r>
+        <w:rPr>
+          <w:b/>
+          <w:i/>
+          <w:iCs/>
+          <w:color w:val="000000"/>
+          <w:sz w:val="18"/>
+          <w:szCs w:val="18"/>
+        </w:rPr>
+        <w:t>deep</w:t>
+      </w:r>
+      <w:proofErr w:type="spellEnd"/>
+      <w:r>
+        <w:rPr>
+          <w:b/>
+          <w:i/>
+          <w:iCs/>
+          <w:color w:val="000000"/>
+          <w:sz w:val="18"/>
+          <w:szCs w:val="18"/>
+        </w:rPr>
+        <w:t xml:space="preserve"> </w:t>
+      </w:r>
+      <w:proofErr w:type="spellStart"/>
+      <w:r>
+        <w:rPr>
+          <w:b/>
+          <w:i/>
+          <w:iCs/>
+          <w:color w:val="000000"/>
+          <w:sz w:val="18"/>
+          <w:szCs w:val="18"/>
+        </w:rPr>
+        <w:t>learning</w:t>
+      </w:r>
+      <w:proofErr w:type="spellEnd"/>
+      <w:r>
+        <w:rPr>
+          <w:b/>
+          <w:i/>
+          <w:iCs/>
+          <w:color w:val="000000"/>
+          <w:sz w:val="18"/>
+          <w:szCs w:val="18"/>
+        </w:rPr>
+        <w:t xml:space="preserve"> </w:t>
+      </w:r>
+      <w:proofErr w:type="spellStart"/>
+      <w:r>
+        <w:rPr>
+          <w:b/>
+          <w:i/>
+          <w:iCs/>
+          <w:color w:val="000000"/>
+          <w:sz w:val="18"/>
+          <w:szCs w:val="18"/>
+        </w:rPr>
+        <w:t>techniques</w:t>
+      </w:r>
+      <w:proofErr w:type="spellEnd"/>
+      <w:r>
+        <w:rPr>
+          <w:b/>
+          <w:i/>
+          <w:iCs/>
+          <w:color w:val="000000"/>
+          <w:sz w:val="18"/>
+          <w:szCs w:val="18"/>
+        </w:rPr>
         <w:t xml:space="preserve">” </w:t>
       </w:r>
       <w:r>
@@ -267,18 +458,7 @@
           <w:sz w:val="18"/>
           <w:szCs w:val="18"/>
         </w:rPr>
-        <w:t>Ahmed</w:t>
-      </w:r>
-      <w:r>
-        <w:rPr>
-          <w:rFonts w:ascii="Times" w:eastAsia="Times" w:hAnsi="Times" w:cs="Times"/>
-          <w:b/>
-          <w:bCs/>
-          <w:iCs/>
-          <w:sz w:val="18"/>
-          <w:szCs w:val="18"/>
-        </w:rPr>
-        <w:t xml:space="preserve"> et.al. (2024)</w:t>
+        <w:t>Ahmed et.al. (2024)</w:t>
       </w:r>
       <w:r>
         <w:rPr>
@@ -399,7 +579,7 @@
           <w:sz w:val="22"/>
           <w:szCs w:val="22"/>
         </w:rPr>
-        <w:t xml:space="preserve">En este definí los criterios de éxito por fases. </w:t>
+        <w:t xml:space="preserve">En este definí los criterios de éxito. </w:t>
       </w:r>
     </w:p>
     <w:p>
@@ -534,56 +714,6 @@
     </w:p>
     <w:p>
       <w:pPr>
-        <w:pStyle w:val="Prrafodelista"/>
-        <w:widowControl w:val="0"/>
-        <w:numPr>
-          <w:ilvl w:val="0"/>
-          <w:numId w:val="15"/>
-        </w:numPr>
-        <w:pBdr>
-          <w:top w:val="nil"/>
-          <w:left w:val="nil"/>
-          <w:bottom w:val="nil"/>
-          <w:right w:val="nil"/>
-          <w:between w:val="nil"/>
-        </w:pBdr>
-        <w:spacing w:before="80" w:line="276" w:lineRule="auto"/>
-        <w:ind w:left="284" w:hanging="284"/>
-        <w:jc w:val="both"/>
-        <w:rPr>
-          <w:sz w:val="22"/>
-          <w:szCs w:val="22"/>
-        </w:rPr>
-      </w:pPr>
-      <w:r>
-        <w:rPr>
-          <w:sz w:val="22"/>
-          <w:szCs w:val="22"/>
-        </w:rPr>
-        <w:t>Poder determinar diferentes segmentos de la canción con su género asociado (estilo bounding box pero en música, de manera que una canción pueda pertenecer a múltiples géneros a la vez)</w:t>
-      </w:r>
-    </w:p>
-    <w:p>
-      <w:pPr>
-        <w:widowControl w:val="0"/>
-        <w:pBdr>
-          <w:top w:val="nil"/>
-          <w:left w:val="nil"/>
-          <w:bottom w:val="nil"/>
-          <w:right w:val="nil"/>
-          <w:between w:val="nil"/>
-        </w:pBdr>
-        <w:spacing w:before="80" w:line="276" w:lineRule="auto"/>
-        <w:ind w:left="284" w:hanging="284"/>
-        <w:jc w:val="both"/>
-        <w:rPr>
-          <w:sz w:val="22"/>
-          <w:szCs w:val="22"/>
-        </w:rPr>
-      </w:pPr>
-    </w:p>
-    <w:p>
-      <w:pPr>
         <w:widowControl w:val="0"/>
         <w:pBdr>
           <w:top w:val="nil"/>
@@ -599,46 +729,6 @@
           <w:szCs w:val="22"/>
         </w:rPr>
       </w:pPr>
-      <w:r>
-        <w:rPr>
-          <w:sz w:val="22"/>
-          <w:szCs w:val="22"/>
-        </w:rPr>
-        <w:t>Estoy utilizando de base la metodología explicada por Ahmed, et.al. en "Musical genre classification using advanced audio analysis and deep learning techniques" (2024).</w:t>
-      </w:r>
-      <w:r>
-        <w:rPr>
-          <w:sz w:val="22"/>
-          <w:szCs w:val="22"/>
-        </w:rPr>
-        <w:t xml:space="preserve"> Este es un estudio del estado del arte donde compara diferentes modelos y acercamientos a este problema por diferentes personas, y compara sus resultados. Lo estoy usando como guía para fundamentar y guiar el proyecto porque explica paso a paso las </w:t>
-      </w:r>
-      <w:r>
-        <w:rPr>
-          <w:sz w:val="22"/>
-          <w:szCs w:val="22"/>
-        </w:rPr>
-        <w:t>diferentes estrategias y da la teoría y matemáticas detrás para el análisis.</w:t>
-      </w:r>
-    </w:p>
-    <w:p>
-      <w:pPr>
-        <w:pStyle w:val="Ttulo1"/>
-        <w:ind w:firstLine="0"/>
-        <w:rPr>
-          <w:sz w:val="28"/>
-          <w:szCs w:val="28"/>
-          <w:lang w:val="es-MX"/>
-        </w:rPr>
-      </w:pPr>
-      <w:r>
-        <w:rPr>
-          <w:sz w:val="28"/>
-          <w:szCs w:val="28"/>
-          <w:lang w:val="es-MX"/>
-        </w:rPr>
-        <w:t>MARCO TEÓRICO</w:t>
-      </w:r>
     </w:p>
     <w:p>
       <w:pPr>
@@ -662,14 +752,161 @@
           <w:sz w:val="22"/>
           <w:szCs w:val="22"/>
         </w:rPr>
-        <w:t xml:space="preserve">El artículo anteriormente mencionado </w:t>
-      </w:r>
-      <w:r>
-        <w:rPr>
-          <w:sz w:val="22"/>
-          <w:szCs w:val="22"/>
-        </w:rPr>
-        <w:t xml:space="preserve">aborda la teoría y diferentes estrategias para la clasificación de música, citando a diferentes autores con sus estrategias para este problema, y resultados. Entre ellos explica arquitecturas de Feed forward neural network (FNN), modelos de convolusión (CNN), modelos de convolusión modificados (Modified CNN), Recurrent Neural Network(RNN-LSTM), Support Vector Machine (SVM), K Nearest Neighbors (KNN) y compara sus resultados. </w:t>
+        <w:t xml:space="preserve">Estoy utilizando de base la metodología explicada por Ahmed, et.al. en "Musical </w:t>
+      </w:r>
+      <w:proofErr w:type="spellStart"/>
+      <w:r>
+        <w:rPr>
+          <w:sz w:val="22"/>
+          <w:szCs w:val="22"/>
+        </w:rPr>
+        <w:t>genre</w:t>
+      </w:r>
+      <w:proofErr w:type="spellEnd"/>
+      <w:r>
+        <w:rPr>
+          <w:sz w:val="22"/>
+          <w:szCs w:val="22"/>
+        </w:rPr>
+        <w:t xml:space="preserve"> </w:t>
+      </w:r>
+      <w:proofErr w:type="spellStart"/>
+      <w:r>
+        <w:rPr>
+          <w:sz w:val="22"/>
+          <w:szCs w:val="22"/>
+        </w:rPr>
+        <w:t>classification</w:t>
+      </w:r>
+      <w:proofErr w:type="spellEnd"/>
+      <w:r>
+        <w:rPr>
+          <w:sz w:val="22"/>
+          <w:szCs w:val="22"/>
+        </w:rPr>
+        <w:t xml:space="preserve"> </w:t>
+      </w:r>
+      <w:proofErr w:type="spellStart"/>
+      <w:r>
+        <w:rPr>
+          <w:sz w:val="22"/>
+          <w:szCs w:val="22"/>
+        </w:rPr>
+        <w:t>using</w:t>
+      </w:r>
+      <w:proofErr w:type="spellEnd"/>
+      <w:r>
+        <w:rPr>
+          <w:sz w:val="22"/>
+          <w:szCs w:val="22"/>
+        </w:rPr>
+        <w:t xml:space="preserve"> </w:t>
+      </w:r>
+      <w:proofErr w:type="spellStart"/>
+      <w:r>
+        <w:rPr>
+          <w:sz w:val="22"/>
+          <w:szCs w:val="22"/>
+        </w:rPr>
+        <w:t>advanced</w:t>
+      </w:r>
+      <w:proofErr w:type="spellEnd"/>
+      <w:r>
+        <w:rPr>
+          <w:sz w:val="22"/>
+          <w:szCs w:val="22"/>
+        </w:rPr>
+        <w:t xml:space="preserve"> audio </w:t>
+      </w:r>
+      <w:proofErr w:type="spellStart"/>
+      <w:r>
+        <w:rPr>
+          <w:sz w:val="22"/>
+          <w:szCs w:val="22"/>
+        </w:rPr>
+        <w:t>analysis</w:t>
+      </w:r>
+      <w:proofErr w:type="spellEnd"/>
+      <w:r>
+        <w:rPr>
+          <w:sz w:val="22"/>
+          <w:szCs w:val="22"/>
+        </w:rPr>
+        <w:t xml:space="preserve"> and </w:t>
+      </w:r>
+      <w:proofErr w:type="spellStart"/>
+      <w:r>
+        <w:rPr>
+          <w:sz w:val="22"/>
+          <w:szCs w:val="22"/>
+        </w:rPr>
+        <w:t>deep</w:t>
+      </w:r>
+      <w:proofErr w:type="spellEnd"/>
+      <w:r>
+        <w:rPr>
+          <w:sz w:val="22"/>
+          <w:szCs w:val="22"/>
+        </w:rPr>
+        <w:t xml:space="preserve"> </w:t>
+      </w:r>
+      <w:proofErr w:type="spellStart"/>
+      <w:r>
+        <w:rPr>
+          <w:sz w:val="22"/>
+          <w:szCs w:val="22"/>
+        </w:rPr>
+        <w:t>learning</w:t>
+      </w:r>
+      <w:proofErr w:type="spellEnd"/>
+      <w:r>
+        <w:rPr>
+          <w:sz w:val="22"/>
+          <w:szCs w:val="22"/>
+        </w:rPr>
+        <w:t xml:space="preserve"> </w:t>
+      </w:r>
+      <w:proofErr w:type="spellStart"/>
+      <w:r>
+        <w:rPr>
+          <w:sz w:val="22"/>
+          <w:szCs w:val="22"/>
+        </w:rPr>
+        <w:t>techniques</w:t>
+      </w:r>
+      <w:proofErr w:type="spellEnd"/>
+      <w:r>
+        <w:rPr>
+          <w:sz w:val="22"/>
+          <w:szCs w:val="22"/>
+        </w:rPr>
+        <w:t>" (2024).</w:t>
+      </w:r>
+      <w:r>
+        <w:rPr>
+          <w:sz w:val="22"/>
+          <w:szCs w:val="22"/>
+        </w:rPr>
+        <w:t xml:space="preserve"> Este es un estudio del estado del arte donde compara diferentes modelos y acercamientos a este problema por diferentes personas, y compara sus resultados. Lo estoy usando como guía para fundamentar y guiar el proyecto porque explica paso a paso las diferentes estrategias y da la teoría y matemáticas detrás para el análisis.</w:t>
+      </w:r>
+    </w:p>
+    <w:p>
+      <w:pPr>
+        <w:pStyle w:val="Ttulo1"/>
+        <w:ind w:firstLine="0"/>
+        <w:rPr>
+          <w:sz w:val="28"/>
+          <w:szCs w:val="28"/>
+          <w:lang w:val="es-MX"/>
+        </w:rPr>
+      </w:pPr>
+      <w:r>
+        <w:rPr>
+          <w:sz w:val="28"/>
+          <w:szCs w:val="28"/>
+          <w:lang w:val="es-MX"/>
+        </w:rPr>
+        <w:t>MARCO TEÓRICO</w:t>
       </w:r>
     </w:p>
     <w:p>
@@ -694,49 +931,158 @@
           <w:sz w:val="22"/>
           <w:szCs w:val="22"/>
         </w:rPr>
-        <w:t xml:space="preserve">En </w:t>
-      </w:r>
-      <w:r>
-        <w:rPr>
-          <w:sz w:val="22"/>
-          <w:szCs w:val="22"/>
-        </w:rPr>
-        <w:t>esta muestra</w:t>
-      </w:r>
-      <w:r>
-        <w:rPr>
-          <w:sz w:val="22"/>
-          <w:szCs w:val="22"/>
-        </w:rPr>
-        <w:t xml:space="preserve"> qu</w:t>
-      </w:r>
-      <w:r>
-        <w:rPr>
-          <w:sz w:val="22"/>
-          <w:szCs w:val="22"/>
-        </w:rPr>
-        <w:t>e</w:t>
-      </w:r>
-      <w:r>
-        <w:rPr>
-          <w:sz w:val="22"/>
-          <w:szCs w:val="22"/>
-        </w:rPr>
-        <w:t xml:space="preserve"> la red modifica CNN fue la que mejor resultados tuvo con una exactitud del 92.7%, seguida de la CNN regular con 85.56% y en </w:t>
-      </w:r>
-      <w:r>
-        <w:rPr>
-          <w:sz w:val="22"/>
-          <w:szCs w:val="22"/>
-        </w:rPr>
-        <w:t>último</w:t>
-      </w:r>
-      <w:r>
-        <w:rPr>
-          <w:sz w:val="22"/>
-          <w:szCs w:val="22"/>
-        </w:rPr>
-        <w:t xml:space="preserve"> lugar KNN con 70%.</w:t>
+        <w:t xml:space="preserve">El artículo anteriormente mencionado </w:t>
+      </w:r>
+      <w:r>
+        <w:rPr>
+          <w:sz w:val="22"/>
+          <w:szCs w:val="22"/>
+        </w:rPr>
+        <w:t xml:space="preserve">aborda la teoría y diferentes estrategias para la clasificación de música, citando a diferentes autores con sus estrategias para este problema, y resultados. Entre ellos explica arquitecturas de </w:t>
+      </w:r>
+      <w:proofErr w:type="spellStart"/>
+      <w:r>
+        <w:rPr>
+          <w:sz w:val="22"/>
+          <w:szCs w:val="22"/>
+        </w:rPr>
+        <w:t>Feed</w:t>
+      </w:r>
+      <w:proofErr w:type="spellEnd"/>
+      <w:r>
+        <w:rPr>
+          <w:sz w:val="22"/>
+          <w:szCs w:val="22"/>
+        </w:rPr>
+        <w:t xml:space="preserve"> forward neural </w:t>
+      </w:r>
+      <w:proofErr w:type="spellStart"/>
+      <w:r>
+        <w:rPr>
+          <w:sz w:val="22"/>
+          <w:szCs w:val="22"/>
+        </w:rPr>
+        <w:t>network</w:t>
+      </w:r>
+      <w:proofErr w:type="spellEnd"/>
+      <w:r>
+        <w:rPr>
+          <w:sz w:val="22"/>
+          <w:szCs w:val="22"/>
+        </w:rPr>
+        <w:t xml:space="preserve"> (FNN), modelos de </w:t>
+      </w:r>
+      <w:proofErr w:type="spellStart"/>
+      <w:r>
+        <w:rPr>
+          <w:sz w:val="22"/>
+          <w:szCs w:val="22"/>
+        </w:rPr>
+        <w:t>convolusión</w:t>
+      </w:r>
+      <w:proofErr w:type="spellEnd"/>
+      <w:r>
+        <w:rPr>
+          <w:sz w:val="22"/>
+          <w:szCs w:val="22"/>
+        </w:rPr>
+        <w:t xml:space="preserve"> (CNN), modelos de </w:t>
+      </w:r>
+      <w:proofErr w:type="spellStart"/>
+      <w:r>
+        <w:rPr>
+          <w:sz w:val="22"/>
+          <w:szCs w:val="22"/>
+        </w:rPr>
+        <w:t>convolusión</w:t>
+      </w:r>
+      <w:proofErr w:type="spellEnd"/>
+      <w:r>
+        <w:rPr>
+          <w:sz w:val="22"/>
+          <w:szCs w:val="22"/>
+        </w:rPr>
+        <w:t xml:space="preserve"> modificados (</w:t>
+      </w:r>
+      <w:proofErr w:type="spellStart"/>
+      <w:r>
+        <w:rPr>
+          <w:sz w:val="22"/>
+          <w:szCs w:val="22"/>
+        </w:rPr>
+        <w:t>Modified</w:t>
+      </w:r>
+      <w:proofErr w:type="spellEnd"/>
+      <w:r>
+        <w:rPr>
+          <w:sz w:val="22"/>
+          <w:szCs w:val="22"/>
+        </w:rPr>
+        <w:t xml:space="preserve"> CNN), </w:t>
+      </w:r>
+      <w:proofErr w:type="spellStart"/>
+      <w:r>
+        <w:rPr>
+          <w:sz w:val="22"/>
+          <w:szCs w:val="22"/>
+        </w:rPr>
+        <w:t>Recurrent</w:t>
+      </w:r>
+      <w:proofErr w:type="spellEnd"/>
+      <w:r>
+        <w:rPr>
+          <w:sz w:val="22"/>
+          <w:szCs w:val="22"/>
+        </w:rPr>
+        <w:t xml:space="preserve"> Neural </w:t>
+      </w:r>
+      <w:proofErr w:type="gramStart"/>
+      <w:r>
+        <w:rPr>
+          <w:sz w:val="22"/>
+          <w:szCs w:val="22"/>
+        </w:rPr>
+        <w:t>Network(</w:t>
+      </w:r>
+      <w:proofErr w:type="gramEnd"/>
+      <w:r>
+        <w:rPr>
+          <w:sz w:val="22"/>
+          <w:szCs w:val="22"/>
+        </w:rPr>
+        <w:t xml:space="preserve">RNN-LSTM), </w:t>
+      </w:r>
+      <w:proofErr w:type="spellStart"/>
+      <w:r>
+        <w:rPr>
+          <w:sz w:val="22"/>
+          <w:szCs w:val="22"/>
+        </w:rPr>
+        <w:t>Support</w:t>
+      </w:r>
+      <w:proofErr w:type="spellEnd"/>
+      <w:r>
+        <w:rPr>
+          <w:sz w:val="22"/>
+          <w:szCs w:val="22"/>
+        </w:rPr>
+        <w:t xml:space="preserve"> Vector Machine (SVM), K </w:t>
+      </w:r>
+      <w:proofErr w:type="spellStart"/>
+      <w:r>
+        <w:rPr>
+          <w:sz w:val="22"/>
+          <w:szCs w:val="22"/>
+        </w:rPr>
+        <w:t>Nearest</w:t>
+      </w:r>
+      <w:proofErr w:type="spellEnd"/>
+      <w:r>
+        <w:rPr>
+          <w:sz w:val="22"/>
+          <w:szCs w:val="22"/>
+        </w:rPr>
+        <w:t xml:space="preserve"> Neighbors (KNN) y compara sus resultados. </w:t>
       </w:r>
     </w:p>
     <w:p>
@@ -756,6 +1102,55 @@
           <w:szCs w:val="22"/>
         </w:rPr>
       </w:pPr>
+      <w:r>
+        <w:rPr>
+          <w:sz w:val="22"/>
+          <w:szCs w:val="22"/>
+        </w:rPr>
+        <w:t xml:space="preserve">En </w:t>
+      </w:r>
+      <w:r>
+        <w:rPr>
+          <w:sz w:val="22"/>
+          <w:szCs w:val="22"/>
+        </w:rPr>
+        <w:t>esta muestra</w:t>
+      </w:r>
+      <w:r>
+        <w:rPr>
+          <w:sz w:val="22"/>
+          <w:szCs w:val="22"/>
+        </w:rPr>
+        <w:t xml:space="preserve"> qu</w:t>
+      </w:r>
+      <w:r>
+        <w:rPr>
+          <w:sz w:val="22"/>
+          <w:szCs w:val="22"/>
+        </w:rPr>
+        <w:t>e</w:t>
+      </w:r>
+      <w:r>
+        <w:rPr>
+          <w:sz w:val="22"/>
+          <w:szCs w:val="22"/>
+        </w:rPr>
+        <w:t xml:space="preserve"> la red modifica CNN fue la que mejor resultados tuvo con una exactitud del 92.7%, seguida de la CNN regular con 85.56% y en </w:t>
+      </w:r>
+      <w:r>
+        <w:rPr>
+          <w:sz w:val="22"/>
+          <w:szCs w:val="22"/>
+        </w:rPr>
+        <w:t>último</w:t>
+      </w:r>
+      <w:r>
+        <w:rPr>
+          <w:sz w:val="22"/>
+          <w:szCs w:val="22"/>
+        </w:rPr>
+        <w:t xml:space="preserve"> lugar KNN con 70%.</w:t>
+      </w:r>
     </w:p>
     <w:p>
       <w:pPr>
@@ -774,27 +1169,6 @@
           <w:szCs w:val="22"/>
         </w:rPr>
       </w:pPr>
-      <w:r>
-        <w:rPr>
-          <w:sz w:val="22"/>
-          <w:szCs w:val="22"/>
-        </w:rPr>
-        <w:t xml:space="preserve">El proceso que sigue el artículo, y que uso como guía para este problema es la extracción de fragmentos de 30 segundos de una canción. Transformar la señal en </w:t>
-      </w:r>
-      <w:r>
-        <w:rPr>
-          <w:sz w:val="22"/>
-          <w:szCs w:val="22"/>
-        </w:rPr>
-        <w:t xml:space="preserve">Mel-Frequency Cepstral Coefficients </w:t>
-      </w:r>
-      <w:r>
-        <w:rPr>
-          <w:sz w:val="22"/>
-          <w:szCs w:val="22"/>
-        </w:rPr>
-        <w:t>(MFCC) y almacenarlos para luego procesarlos con los diferentes modelos y hacer el diagnóstico final.  Se usa este modelo de frecuencia para simular la audición humana, extrayendo señales importantes del audio y es menos afectada por el ruido.</w:t>
-      </w:r>
     </w:p>
     <w:p>
       <w:pPr>
@@ -818,7 +1192,69 @@
           <w:sz w:val="22"/>
           <w:szCs w:val="22"/>
         </w:rPr>
-        <w:t>MFCC tiene varios puntos positivos, elimina el ruido de la señal facilitando extraer características importantes del género musical. Al igual que mejora el rendimiento del modelo y acelerando el tiempo de procesamiento al disminuir la complejidad computacional.</w:t>
+        <w:t xml:space="preserve">El proceso que sigue el artículo, y que uso como guía para este problema es la extracción de fragmentos de 30 segundos de una canción. Transformar la señal en </w:t>
+      </w:r>
+      <w:r>
+        <w:rPr>
+          <w:sz w:val="22"/>
+          <w:szCs w:val="22"/>
+        </w:rPr>
+        <w:t>Mel-</w:t>
+      </w:r>
+      <w:proofErr w:type="spellStart"/>
+      <w:r>
+        <w:rPr>
+          <w:sz w:val="22"/>
+          <w:szCs w:val="22"/>
+        </w:rPr>
+        <w:t>Frequency</w:t>
+      </w:r>
+      <w:proofErr w:type="spellEnd"/>
+      <w:r>
+        <w:rPr>
+          <w:sz w:val="22"/>
+          <w:szCs w:val="22"/>
+        </w:rPr>
+        <w:t xml:space="preserve"> </w:t>
+      </w:r>
+      <w:proofErr w:type="spellStart"/>
+      <w:r>
+        <w:rPr>
+          <w:sz w:val="22"/>
+          <w:szCs w:val="22"/>
+        </w:rPr>
+        <w:t>Cepstral</w:t>
+      </w:r>
+      <w:proofErr w:type="spellEnd"/>
+      <w:r>
+        <w:rPr>
+          <w:sz w:val="22"/>
+          <w:szCs w:val="22"/>
+        </w:rPr>
+        <w:t xml:space="preserve"> </w:t>
+      </w:r>
+      <w:proofErr w:type="spellStart"/>
+      <w:r>
+        <w:rPr>
+          <w:sz w:val="22"/>
+          <w:szCs w:val="22"/>
+        </w:rPr>
+        <w:t>Coefficients</w:t>
+      </w:r>
+      <w:proofErr w:type="spellEnd"/>
+      <w:r>
+        <w:rPr>
+          <w:sz w:val="22"/>
+          <w:szCs w:val="22"/>
+        </w:rPr>
+        <w:t xml:space="preserve"> </w:t>
+      </w:r>
+      <w:r>
+        <w:rPr>
+          <w:sz w:val="22"/>
+          <w:szCs w:val="22"/>
+        </w:rPr>
+        <w:t>(MFCC) y almacenarlos para luego procesarlos con los diferentes modelos y hacer el diagnóstico final.  Se usa este modelo de frecuencia para simular la audición humana, extrayendo señales importantes del audio y es menos afectada por el ruido.</w:t>
       </w:r>
     </w:p>
     <w:p>
@@ -838,6 +1274,13 @@
           <w:szCs w:val="22"/>
         </w:rPr>
       </w:pPr>
+      <w:r>
+        <w:rPr>
+          <w:sz w:val="22"/>
+          <w:szCs w:val="22"/>
+        </w:rPr>
+        <w:t>MFCC tiene varios puntos positivos, elimina el ruido de la señal facilitando extraer características importantes del género musical. Al igual que mejora el rendimiento del modelo y acelerando el tiempo de procesamiento al disminuir la complejidad computacional.</w:t>
+      </w:r>
     </w:p>
     <w:p>
       <w:pPr>
@@ -856,20 +1299,46 @@
           <w:szCs w:val="22"/>
         </w:rPr>
       </w:pPr>
-      <w:r>
-        <w:rPr>
-          <w:sz w:val="22"/>
-          <w:szCs w:val="22"/>
-        </w:rPr>
-        <w:t xml:space="preserve">Decidí utilizar los modelos de CNN y CNN modificada, debido a que son temas relacionados con lo visto en clase y aquellos que demostraron mejores resultados entre todas las opciones. Primero implementando CNN y CNN modificada, tras el diagnóstico ver que resultados </w:t>
-      </w:r>
-      <w:r>
-        <w:rPr>
-          <w:sz w:val="22"/>
-          <w:szCs w:val="22"/>
-        </w:rPr>
-        <w:lastRenderedPageBreak/>
-        <w:t xml:space="preserve">muestra y decidir cual modelo tratar de mejorar. </w:t>
+    </w:p>
+    <w:p>
+      <w:pPr>
+        <w:widowControl w:val="0"/>
+        <w:pBdr>
+          <w:top w:val="nil"/>
+          <w:left w:val="nil"/>
+          <w:bottom w:val="nil"/>
+          <w:right w:val="nil"/>
+          <w:between w:val="nil"/>
+        </w:pBdr>
+        <w:spacing w:before="80" w:line="276" w:lineRule="auto"/>
+        <w:jc w:val="both"/>
+        <w:rPr>
+          <w:sz w:val="22"/>
+          <w:szCs w:val="22"/>
+        </w:rPr>
+      </w:pPr>
+      <w:r>
+        <w:rPr>
+          <w:sz w:val="22"/>
+          <w:szCs w:val="22"/>
+        </w:rPr>
+        <w:t xml:space="preserve">Decidí utilizar los modelos de CNN y CNN modificada, debido a que son temas relacionados con lo visto en clase y aquellos que demostraron mejores resultados entre todas las opciones. Primero implementando CNN y CNN modificada, tras el diagnóstico ver </w:t>
+      </w:r>
+      <w:proofErr w:type="spellStart"/>
+      <w:r>
+        <w:rPr>
+          <w:sz w:val="22"/>
+          <w:szCs w:val="22"/>
+        </w:rPr>
+        <w:t>que</w:t>
+      </w:r>
+      <w:proofErr w:type="spellEnd"/>
+      <w:r>
+        <w:rPr>
+          <w:sz w:val="22"/>
+          <w:szCs w:val="22"/>
+        </w:rPr>
+        <w:t xml:space="preserve"> resultados muestra y decidir cual modelo tratar de mejorar. </w:t>
       </w:r>
     </w:p>
     <w:p>
@@ -960,7 +1429,23 @@
           <w:sz w:val="22"/>
           <w:szCs w:val="22"/>
         </w:rPr>
-        <w:t xml:space="preserve"> (Tensorflow, s.f.)</w:t>
+        <w:t xml:space="preserve"> (</w:t>
+      </w:r>
+      <w:proofErr w:type="spellStart"/>
+      <w:r>
+        <w:rPr>
+          <w:sz w:val="22"/>
+          <w:szCs w:val="22"/>
+        </w:rPr>
+        <w:t>Tensorflow</w:t>
+      </w:r>
+      <w:proofErr w:type="spellEnd"/>
+      <w:r>
+        <w:rPr>
+          <w:sz w:val="22"/>
+          <w:szCs w:val="22"/>
+        </w:rPr>
+        <w:t>, s.f.)</w:t>
       </w:r>
       <w:r>
         <w:rPr>
@@ -1018,7 +1503,39 @@
           <w:sz w:val="22"/>
           <w:szCs w:val="22"/>
         </w:rPr>
-        <w:t>No pude encontrar la importación original de Tensorflow, pero si los archivos locales, así que estos los leo manualmente e integro en un dataframe de pandas.</w:t>
+        <w:t xml:space="preserve">No pude encontrar la importación original de </w:t>
+      </w:r>
+      <w:proofErr w:type="spellStart"/>
+      <w:r>
+        <w:rPr>
+          <w:sz w:val="22"/>
+          <w:szCs w:val="22"/>
+        </w:rPr>
+        <w:t>Tensorflow</w:t>
+      </w:r>
+      <w:proofErr w:type="spellEnd"/>
+      <w:r>
+        <w:rPr>
+          <w:sz w:val="22"/>
+          <w:szCs w:val="22"/>
+        </w:rPr>
+        <w:t xml:space="preserve">, pero si los archivos locales, así que estos los leo manualmente e integro en un </w:t>
+      </w:r>
+      <w:proofErr w:type="spellStart"/>
+      <w:r>
+        <w:rPr>
+          <w:sz w:val="22"/>
+          <w:szCs w:val="22"/>
+        </w:rPr>
+        <w:t>dataframe</w:t>
+      </w:r>
+      <w:proofErr w:type="spellEnd"/>
+      <w:r>
+        <w:rPr>
+          <w:sz w:val="22"/>
+          <w:szCs w:val="22"/>
+        </w:rPr>
+        <w:t xml:space="preserve"> de pandas.</w:t>
       </w:r>
       <w:r>
         <w:rPr>
@@ -1149,7 +1666,23 @@
                 <w:sz w:val="22"/>
                 <w:szCs w:val="22"/>
               </w:rPr>
-              <w:t>WAV (Librosa)</w:t>
+              <w:t>WAV (</w:t>
+            </w:r>
+            <w:proofErr w:type="spellStart"/>
+            <w:r>
+              <w:rPr>
+                <w:sz w:val="22"/>
+                <w:szCs w:val="22"/>
+              </w:rPr>
+              <w:t>Librosa</w:t>
+            </w:r>
+            <w:proofErr w:type="spellEnd"/>
+            <w:r>
+              <w:rPr>
+                <w:sz w:val="22"/>
+                <w:szCs w:val="22"/>
+              </w:rPr>
+              <w:t>)</w:t>
             </w:r>
           </w:p>
         </w:tc>
@@ -1285,22 +1818,23 @@
           <w:sz w:val="24"/>
           <w:szCs w:val="24"/>
         </w:rPr>
-        <w:t>Para la primera fase de entendimiento de los datos cargué los diferentes archivos de GZTAN en Python generando el dataframe antes mencionado.</w:t>
-      </w:r>
-    </w:p>
-    <w:p>
-      <w:pPr>
+        <w:t xml:space="preserve">Para la primera fase de entendimiento de los datos cargué los diferentes archivos de GZTAN en Python generando el </w:t>
+      </w:r>
+      <w:proofErr w:type="spellStart"/>
+      <w:r>
         <w:rPr>
           <w:sz w:val="24"/>
           <w:szCs w:val="24"/>
         </w:rPr>
-      </w:pPr>
+        <w:t>dataframe</w:t>
+      </w:r>
+      <w:proofErr w:type="spellEnd"/>
       <w:r>
         <w:rPr>
           <w:sz w:val="24"/>
           <w:szCs w:val="24"/>
         </w:rPr>
-        <w:t>Una vez que estaba cargado hice una gráfica para mostrar: Las frecuencias de audio de la canción, su transformación de Fourier y MFCC. Este último siendo el que utilizará el modelo.</w:t>
+        <w:t xml:space="preserve"> antes mencionado.</w:t>
       </w:r>
     </w:p>
     <w:p>
@@ -1310,27 +1844,58 @@
           <w:szCs w:val="24"/>
         </w:rPr>
       </w:pPr>
-    </w:p>
-    <w:p>
-      <w:pPr>
+      <w:r>
         <w:rPr>
           <w:sz w:val="24"/>
           <w:szCs w:val="24"/>
         </w:rPr>
-      </w:pPr>
-      <w:r>
+        <w:t>Una vez que estaba cargado hice una gráfica para mostrar: Las frecuencias de audio de la canción, su transformación de Fourier y MFCC. Este último siendo el que utilizará el modelo.</w:t>
+      </w:r>
+    </w:p>
+    <w:p>
+      <w:pPr>
         <w:rPr>
           <w:sz w:val="24"/>
           <w:szCs w:val="24"/>
         </w:rPr>
-        <w:t>Primero con las frecuencias de audio</w:t>
-      </w:r>
-      <w:r>
+      </w:pPr>
+    </w:p>
+    <w:p>
+      <w:pPr>
         <w:rPr>
           <w:sz w:val="24"/>
           <w:szCs w:val="24"/>
         </w:rPr>
-        <w:t xml:space="preserve">, no hay muchos detalles que se puedan apreciar, la música disco tiene algunos picos ligeros, la música metálica parece ser la más estruendosa, y la rock un poco por detrás del metal, con mayor densidad. </w:t>
+      </w:pPr>
+      <w:r>
+        <w:rPr>
+          <w:sz w:val="24"/>
+          <w:szCs w:val="24"/>
+        </w:rPr>
+        <w:t>Primero con las frecuencias de audio</w:t>
+      </w:r>
+      <w:r>
+        <w:rPr>
+          <w:sz w:val="24"/>
+          <w:szCs w:val="24"/>
+        </w:rPr>
+        <w:t xml:space="preserve">, no hay muchos detalles que se puedan apreciar, la música disco tiene algunos picos ligeros, la música metálica parece ser la más estruendosa, y </w:t>
+      </w:r>
+      <w:proofErr w:type="gramStart"/>
+      <w:r>
+        <w:rPr>
+          <w:sz w:val="24"/>
+          <w:szCs w:val="24"/>
+        </w:rPr>
+        <w:t>la rock</w:t>
+      </w:r>
+      <w:proofErr w:type="gramEnd"/>
+      <w:r>
+        <w:rPr>
+          <w:sz w:val="24"/>
+          <w:szCs w:val="24"/>
+        </w:rPr>
+        <w:t xml:space="preserve"> un poco por detrás del metal, con mayor densidad. </w:t>
       </w:r>
     </w:p>
     <w:p>
@@ -1390,7 +1955,18 @@
     </w:p>
     <w:p>
       <w:r>
-        <w:t>En las gráficas de Transformadas de Fourier un poco similar se puede ver que la música pop es aquella con mayor magnitud, e igual están las frecuencias de Mel. Honestamente no sabría como interpretar las gráficas, pero el propósito del modelo es poder extraer las características más importantes de estas para la clasificación de las canciones.</w:t>
+        <w:t xml:space="preserve">En las gráficas de Transformadas de Fourier un poco similar se puede ver que la música pop es aquella con mayor magnitud, e igual están las frecuencias de Mel. Honestamente no sabría </w:t>
+      </w:r>
+      <w:proofErr w:type="spellStart"/>
+      <w:r>
+        <w:t>como</w:t>
+      </w:r>
+      <w:proofErr w:type="spellEnd"/>
+      <w:r>
+        <w:t xml:space="preserve"> interpretar las gráficas, pero el propósito del </w:t>
+      </w:r>
+      <w:r>
+        <w:t>modelo es poder extraer las características más importantes de estas para la clasificación de las canciones.</w:t>
       </w:r>
     </w:p>
     <w:p>
@@ -1505,7 +2081,41 @@
     </w:p>
     <w:p>
       <w:r>
-        <w:t xml:space="preserve">El dataset contiene 100 canciones por género, siendo los géneros: blues, classical, country,disco, hiphop, jazz, metal, pop, raggae. De estos, casi todos tienen 100 canciones excepto Jazz, debido a que una de sus canciones es corrupta. </w:t>
+        <w:t xml:space="preserve">El dataset contiene 100 canciones por género, siendo los géneros: blues, </w:t>
+      </w:r>
+      <w:proofErr w:type="spellStart"/>
+      <w:r>
+        <w:t>classical</w:t>
+      </w:r>
+      <w:proofErr w:type="spellEnd"/>
+      <w:r>
+        <w:t xml:space="preserve">, </w:t>
+      </w:r>
+      <w:proofErr w:type="spellStart"/>
+      <w:proofErr w:type="gramStart"/>
+      <w:r>
+        <w:t>country,disco</w:t>
+      </w:r>
+      <w:proofErr w:type="spellEnd"/>
+      <w:proofErr w:type="gramEnd"/>
+      <w:r>
+        <w:t xml:space="preserve">, </w:t>
+      </w:r>
+      <w:proofErr w:type="spellStart"/>
+      <w:r>
+        <w:t>hiphop</w:t>
+      </w:r>
+      <w:proofErr w:type="spellEnd"/>
+      <w:r>
+        <w:t xml:space="preserve">, jazz, metal, pop, </w:t>
+      </w:r>
+      <w:proofErr w:type="spellStart"/>
+      <w:r>
+        <w:t>raggae</w:t>
+      </w:r>
+      <w:proofErr w:type="spellEnd"/>
+      <w:r>
+        <w:t xml:space="preserve">. De estos, casi todos tienen 100 canciones excepto Jazz, debido a que una de sus canciones es corrupta. </w:t>
       </w:r>
     </w:p>
     <w:p/>
@@ -1535,7 +2145,60 @@
     </w:p>
     <w:p>
       <w:r>
-        <w:t>Para el funcionamiento correcto del modelo es necesario transformar las canciones de su forma original (archivos .wav), en su Mel-Frequency. Para ello encontré algunos problemas cargando toda la información y transformándola en su totalidad debido a que mi computadora, pese a contar con 16 Gbs de Ram, se quedaba sin memoria. Por ello opté por separar los archivos en batches de 50 canciones y guardarlas en sus propios archivos .npz.</w:t>
+        <w:t>Para el funcionamiento correcto del modelo es necesario transformar las canciones de su forma original (archivos .</w:t>
+      </w:r>
+      <w:proofErr w:type="spellStart"/>
+      <w:r>
+        <w:t>wav</w:t>
+      </w:r>
+      <w:proofErr w:type="spellEnd"/>
+      <w:r>
+        <w:t>), en su Mel-</w:t>
+      </w:r>
+      <w:proofErr w:type="spellStart"/>
+      <w:r>
+        <w:t>Frequency</w:t>
+      </w:r>
+      <w:proofErr w:type="spellEnd"/>
+      <w:r>
+        <w:t xml:space="preserve">. Para ello encontré algunos problemas cargando toda la información y transformándola en su totalidad debido a que mi computadora, pese a contar con 16 </w:t>
+      </w:r>
+      <w:proofErr w:type="spellStart"/>
+      <w:r>
+        <w:t>Gbs</w:t>
+      </w:r>
+      <w:proofErr w:type="spellEnd"/>
+      <w:r>
+        <w:t xml:space="preserve"> de </w:t>
+      </w:r>
+      <w:proofErr w:type="spellStart"/>
+      <w:r>
+        <w:t>Ram</w:t>
+      </w:r>
+      <w:proofErr w:type="spellEnd"/>
+      <w:r>
+        <w:t xml:space="preserve">, se quedaba sin memoria. Por ello opté por separar los archivos en </w:t>
+      </w:r>
+      <w:proofErr w:type="spellStart"/>
+      <w:r>
+        <w:t>batches</w:t>
+      </w:r>
+      <w:proofErr w:type="spellEnd"/>
+      <w:r>
+        <w:t xml:space="preserve"> de 50 canciones y guardarlas en sus propios </w:t>
+      </w:r>
+      <w:proofErr w:type="gramStart"/>
+      <w:r>
+        <w:t>archivos .</w:t>
+      </w:r>
+      <w:proofErr w:type="spellStart"/>
+      <w:r>
+        <w:t>npz</w:t>
+      </w:r>
+      <w:proofErr w:type="spellEnd"/>
+      <w:proofErr w:type="gramEnd"/>
+      <w:r>
+        <w:t>.</w:t>
       </w:r>
     </w:p>
     <w:p/>
@@ -1550,8 +2213,20 @@
     <w:p/>
     <w:p>
       <w:r>
-        <w:lastRenderedPageBreak/>
-        <w:t xml:space="preserve">Se almacenan la información de 50 canciones antes de guardarlo en un archivo .npz, generando un total de 20 archivos que se utilizarán para el modelado. </w:t>
+        <w:t xml:space="preserve">Se almacenan la información de 50 canciones antes de guardarlo en un </w:t>
+      </w:r>
+      <w:proofErr w:type="gramStart"/>
+      <w:r>
+        <w:t>archivo .</w:t>
+      </w:r>
+      <w:proofErr w:type="spellStart"/>
+      <w:r>
+        <w:t>npz</w:t>
+      </w:r>
+      <w:proofErr w:type="spellEnd"/>
+      <w:proofErr w:type="gramEnd"/>
+      <w:r>
+        <w:t xml:space="preserve">, generando un total de 20 archivos que se utilizarán para el modelado. </w:t>
       </w:r>
     </w:p>
     <w:p>
@@ -1570,6 +2245,7 @@
           <w:szCs w:val="28"/>
           <w:lang w:val="es-MX"/>
         </w:rPr>
+        <w:lastRenderedPageBreak/>
         <w:t>FUNCIONAMIENTO DEL MODELO</w:t>
       </w:r>
     </w:p>
@@ -1581,13 +2257,37 @@
         <w:t>mencionó</w:t>
       </w:r>
       <w:r>
-        <w:t xml:space="preserve"> anteriormente sería una red neuronal Convolucional. Debido al mismo problema de falta de memoria para trabajar con los datos de manera directa y bruta igual trabajé con batches. En este momento cargué el nombre de los archivos para un Split de 70% entrenamiento, 15% validación y otro 15% pruebas. </w:t>
+        <w:t xml:space="preserve"> anteriormente sería una red neuronal Convolucional. Debido al mismo problema de falta de memoria para trabajar con los datos de manera directa y bruta igual trabajé con </w:t>
+      </w:r>
+      <w:proofErr w:type="spellStart"/>
+      <w:r>
+        <w:t>batches</w:t>
+      </w:r>
+      <w:proofErr w:type="spellEnd"/>
+      <w:r>
+        <w:t xml:space="preserve">. En este momento cargué el nombre de los archivos para un Split de 70% entrenamiento, 15% validación y otro 15% pruebas. </w:t>
       </w:r>
     </w:p>
     <w:p/>
     <w:p>
       <w:r>
-        <w:t xml:space="preserve">Luego decidí ejecutar una normalización y encoder en los datos para el entrenamiento, para esto cargué todos los datos uno a la vez para almacenar los géneros para que pueda codificarlos, y guardar información de las MFCC. Esto me ayudo a tener la información general de todos los archivos para tener los labels codificados para el entrenamiento y pruebas al igual que tener la media, y desviación estándar para la normalización de las frecuencias. </w:t>
+        <w:t xml:space="preserve">Luego decidí ejecutar una normalización y </w:t>
+      </w:r>
+      <w:proofErr w:type="spellStart"/>
+      <w:r>
+        <w:t>encoder</w:t>
+      </w:r>
+      <w:proofErr w:type="spellEnd"/>
+      <w:r>
+        <w:t xml:space="preserve"> en los datos para el entrenamiento, para esto cargué todos los datos uno a la vez para almacenar los géneros para que pueda codificarlos, y guardar información de las MFCC. Esto me ayudo a tener la información general de todos los archivos para tener los </w:t>
+      </w:r>
+      <w:proofErr w:type="spellStart"/>
+      <w:r>
+        <w:t>labels</w:t>
+      </w:r>
+      <w:proofErr w:type="spellEnd"/>
+      <w:r>
+        <w:t xml:space="preserve"> codificados para el entrenamiento y pruebas al igual que tener la media, y desviación estándar para la normalización de las frecuencias. </w:t>
       </w:r>
     </w:p>
     <w:p>
@@ -1601,19 +2301,67 @@
     <w:p/>
     <w:p>
       <w:r>
-        <w:t xml:space="preserve">Ahora, para realmente el entrenamiento: creé un generador que carga las frecuencias MFCC y género de las canciones en batches de 16 para el proceso de entrenamiento, validación y pruebas. </w:t>
+        <w:t xml:space="preserve">Ahora, para realmente el entrenamiento: creé un generador que carga las frecuencias MFCC y género de las canciones en </w:t>
+      </w:r>
+      <w:proofErr w:type="spellStart"/>
+      <w:r>
+        <w:t>batches</w:t>
+      </w:r>
+      <w:proofErr w:type="spellEnd"/>
+      <w:r>
+        <w:t xml:space="preserve"> de 16 para el proceso de entrenamiento, validación y pruebas. </w:t>
       </w:r>
     </w:p>
     <w:p/>
     <w:p>
       <w:r>
-        <w:t xml:space="preserve">El modelo, empieza por un input con el tamaño de entrada (MFCC) y de salida (Géneros), seguido de 3 capas de Convolusión2D y MaxPooling que progresivamente van extrayendo la información de las imágenes. Finalmente se encuentra una capa densa, un Dropout para evitar overfitting y una última capa densa que hace la selección correcta utilizando softmax. </w:t>
+        <w:t xml:space="preserve">El modelo, empieza por un input con el tamaño de entrada (MFCC) y de salida (Géneros), seguido de 3 capas de Convolusión2D y </w:t>
+      </w:r>
+      <w:proofErr w:type="spellStart"/>
+      <w:r>
+        <w:t>MaxPooling</w:t>
+      </w:r>
+      <w:proofErr w:type="spellEnd"/>
+      <w:r>
+        <w:t xml:space="preserve"> que progresivamente van extrayendo la información de las imágenes. Finalmente se encuentra una capa densa, un </w:t>
+      </w:r>
+      <w:proofErr w:type="spellStart"/>
+      <w:r>
+        <w:t>Dropout</w:t>
+      </w:r>
+      <w:proofErr w:type="spellEnd"/>
+      <w:r>
+        <w:t xml:space="preserve"> para evitar </w:t>
+      </w:r>
+      <w:proofErr w:type="spellStart"/>
+      <w:r>
+        <w:t>overfitting</w:t>
+      </w:r>
+      <w:proofErr w:type="spellEnd"/>
+      <w:r>
+        <w:t xml:space="preserve"> y una última capa densa que hace la selección correcta utilizando </w:t>
+      </w:r>
+      <w:proofErr w:type="spellStart"/>
+      <w:r>
+        <w:t>softmax</w:t>
+      </w:r>
+      <w:proofErr w:type="spellEnd"/>
+      <w:r>
+        <w:t xml:space="preserve">. </w:t>
       </w:r>
     </w:p>
     <w:p/>
     <w:p>
       <w:r>
-        <w:t xml:space="preserve">Al compilar el modelo se utiliza Adam para optimizar el modelo, CategoricalCrossentropy para poder ajustar el error y las métricas de exactitud y precisión, y F1 esto para poder tener una mejor idea de cómo se está adaptando el modelo y tomar en cuenta </w:t>
+        <w:t xml:space="preserve">Al compilar el modelo se utiliza Adam para optimizar el modelo, </w:t>
+      </w:r>
+      <w:proofErr w:type="spellStart"/>
+      <w:r>
+        <w:t>CategoricalCrossentropy</w:t>
+      </w:r>
+      <w:proofErr w:type="spellEnd"/>
+      <w:r>
+        <w:t xml:space="preserve"> para poder ajustar el error y las métricas de exactitud y precisión, y F1 esto para poder tener una mejor idea de cómo se está adaptando el modelo y tomar en cuenta </w:t>
       </w:r>
       <w:r>
         <w:t>en realidad</w:t>
@@ -1672,6 +2420,7 @@
                 <w:lang w:val="en-US"/>
               </w:rPr>
             </w:pPr>
+            <w:proofErr w:type="spellStart"/>
             <w:r>
               <w:rPr>
                 <w:b/>
@@ -1680,6 +2429,7 @@
               </w:rPr>
               <w:t>Métrica</w:t>
             </w:r>
+            <w:proofErr w:type="spellEnd"/>
           </w:p>
         </w:tc>
         <w:tc>
@@ -1717,12 +2467,14 @@
                 <w:lang w:val="en-US"/>
               </w:rPr>
             </w:pPr>
+            <w:proofErr w:type="spellStart"/>
             <w:r>
               <w:rPr>
                 <w:lang w:val="en-US"/>
               </w:rPr>
               <w:t>Pérdida</w:t>
             </w:r>
+            <w:proofErr w:type="spellEnd"/>
           </w:p>
         </w:tc>
         <w:tc>
@@ -1755,12 +2507,14 @@
                 <w:lang w:val="en-US"/>
               </w:rPr>
             </w:pPr>
+            <w:proofErr w:type="spellStart"/>
             <w:r>
               <w:rPr>
                 <w:lang w:val="en-US"/>
               </w:rPr>
               <w:t>Exactitud</w:t>
             </w:r>
+            <w:proofErr w:type="spellEnd"/>
           </w:p>
         </w:tc>
         <w:tc>
@@ -1867,12 +2621,14 @@
                 <w:lang w:val="en-US"/>
               </w:rPr>
             </w:pPr>
+            <w:proofErr w:type="spellStart"/>
             <w:r>
               <w:rPr>
                 <w:lang w:val="en-US"/>
               </w:rPr>
               <w:t>Precisión</w:t>
             </w:r>
+            <w:proofErr w:type="spellEnd"/>
           </w:p>
         </w:tc>
         <w:tc>
@@ -1926,14 +2682,34 @@
           <w:lang w:val="en-US"/>
         </w:rPr>
       </w:pPr>
+      <w:proofErr w:type="spellStart"/>
       <w:r>
         <w:rPr>
           <w:b/>
           <w:bCs/>
           <w:lang w:val="en-US"/>
         </w:rPr>
-        <w:t>Reporte de clasificación</w:t>
-      </w:r>
+        <w:t>Reporte</w:t>
+      </w:r>
+      <w:proofErr w:type="spellEnd"/>
+      <w:r>
+        <w:rPr>
+          <w:b/>
+          <w:bCs/>
+          <w:lang w:val="en-US"/>
+        </w:rPr>
+        <w:t xml:space="preserve"> de </w:t>
+      </w:r>
+      <w:proofErr w:type="spellStart"/>
+      <w:r>
+        <w:rPr>
+          <w:b/>
+          <w:bCs/>
+          <w:lang w:val="en-US"/>
+        </w:rPr>
+        <w:t>clasificación</w:t>
+      </w:r>
+      <w:proofErr w:type="spellEnd"/>
     </w:p>
     <w:tbl>
       <w:tblPr>
@@ -1960,12 +2736,14 @@
                 <w:lang w:val="en-US"/>
               </w:rPr>
             </w:pPr>
+            <w:proofErr w:type="spellStart"/>
             <w:r>
               <w:rPr>
                 <w:lang w:val="en-US"/>
               </w:rPr>
               <w:t>Género</w:t>
             </w:r>
+            <w:proofErr w:type="spellEnd"/>
           </w:p>
         </w:tc>
         <w:tc>
@@ -2032,12 +2810,14 @@
                 <w:lang w:val="en-US"/>
               </w:rPr>
             </w:pPr>
+            <w:proofErr w:type="spellStart"/>
             <w:r>
               <w:rPr>
                 <w:lang w:val="en-US"/>
               </w:rPr>
               <w:t>Cantidad</w:t>
             </w:r>
+            <w:proofErr w:type="spellEnd"/>
           </w:p>
         </w:tc>
       </w:tr>
@@ -2144,9 +2924,11 @@
                 <w:lang w:val="en-US"/>
               </w:rPr>
             </w:pPr>
+            <w:proofErr w:type="spellStart"/>
             <w:r>
               <w:t>Classical</w:t>
             </w:r>
+            <w:proofErr w:type="spellEnd"/>
           </w:p>
         </w:tc>
         <w:tc>
@@ -2375,9 +3157,11 @@
                 <w:lang w:val="en-US"/>
               </w:rPr>
             </w:pPr>
+            <w:proofErr w:type="spellStart"/>
             <w:r>
               <w:t>Hiphop</w:t>
             </w:r>
+            <w:proofErr w:type="spellEnd"/>
           </w:p>
         </w:tc>
         <w:tc>
@@ -2783,7 +3567,15 @@
         <w:t>que Clásico</w:t>
       </w:r>
       <w:r>
-        <w:t xml:space="preserve">, Pop y Hip-hop son aquellos que tienen un menor error. </w:t>
+        <w:t xml:space="preserve">, Pop </w:t>
+      </w:r>
+      <w:proofErr w:type="spellStart"/>
+      <w:r>
+        <w:t>y</w:t>
+      </w:r>
+      <w:proofErr w:type="spellEnd"/>
+      <w:r>
+        <w:t xml:space="preserve"> Hip-hop son aquellos que tienen un menor error. </w:t>
       </w:r>
       <w:r>
         <w:rPr>
@@ -2844,7 +3636,6 @@
         <w:rPr>
           <w:noProof/>
         </w:rPr>
-        <w:lastRenderedPageBreak/>
         <w:drawing>
           <wp:inline distT="0" distB="0" distL="0" distR="0" wp14:anchorId="00A8468A" wp14:editId="04A76526">
             <wp:extent cx="3061335" cy="2298065"/>
@@ -2912,12 +3703,29 @@
           <w:szCs w:val="28"/>
           <w:lang w:val="es-MX"/>
         </w:rPr>
+        <w:lastRenderedPageBreak/>
         <w:t>DIAGNÓSTICO</w:t>
       </w:r>
     </w:p>
     <w:p>
       <w:r>
-        <w:t>Las métricas utilizadas para esta primera iteración del proyecto muestran resultados por debajo de lo esperado y reportado en el reporte original de Ahmed, et.al (2024). Esto puede deberse a una variabilidad en la construcción del modelo dado que la construcción del mismo fue una interpretación de la explicación utilizada al igual que la ausencia de hiperparámetros reportados en el reporte.</w:t>
+        <w:t xml:space="preserve">Las métricas utilizadas para esta primera iteración del proyecto muestran resultados por debajo de lo esperado y reportado en el reporte original de Ahmed, et.al (2024). Esto puede deberse a una variabilidad en la construcción del modelo dado que la construcción </w:t>
+      </w:r>
+      <w:proofErr w:type="gramStart"/>
+      <w:r>
+        <w:t>del mismo</w:t>
+      </w:r>
+      <w:proofErr w:type="gramEnd"/>
+      <w:r>
+        <w:t xml:space="preserve"> fue una interpretación de la explicación utilizada al igual que la ausencia de </w:t>
+      </w:r>
+      <w:proofErr w:type="spellStart"/>
+      <w:r>
+        <w:t>hiperparámetros</w:t>
+      </w:r>
+      <w:proofErr w:type="spellEnd"/>
+      <w:r>
+        <w:t xml:space="preserve"> reportados en el reporte.</w:t>
       </w:r>
     </w:p>
     <w:p/>
@@ -2967,9 +3775,11 @@
             <w:tcW w:w="1654" w:type="dxa"/>
           </w:tcPr>
           <w:p>
+            <w:proofErr w:type="spellStart"/>
             <w:r>
               <w:t>Accuracy</w:t>
             </w:r>
+            <w:proofErr w:type="spellEnd"/>
           </w:p>
         </w:tc>
         <w:tc>
@@ -3040,9 +3850,11 @@
             <w:tcW w:w="1654" w:type="dxa"/>
           </w:tcPr>
           <w:p>
+            <w:proofErr w:type="spellStart"/>
             <w:r>
               <w:t>Precision</w:t>
             </w:r>
+            <w:proofErr w:type="spellEnd"/>
           </w:p>
         </w:tc>
         <w:tc>
@@ -3109,7 +3921,23 @@
     </w:p>
     <w:p>
       <w:r>
-        <w:t xml:space="preserve">Traté de adaptar un poco más la arquitectura de mi modelo a la explicada en el artículo, utilizando la descripción tal cual se explica en el artículo no me dio muy buenos resultados, pero si utilicé estrategias que menciona. En este caso cambié el orden de las capas de convolusión para que vayan disminuyendo en lugar de aumentando de tamaño (128-64-32), al igual que integrar un BatchNormalization después de las primeras dos capas.  </w:t>
+        <w:t xml:space="preserve">Traté de adaptar un poco más la arquitectura de mi modelo a la explicada en el artículo, utilizando la descripción tal cual se explica en el artículo no me dio muy buenos resultados, pero si utilicé estrategias que menciona. En este caso cambié el orden de las capas de </w:t>
+      </w:r>
+      <w:proofErr w:type="spellStart"/>
+      <w:r>
+        <w:t>convolusión</w:t>
+      </w:r>
+      <w:proofErr w:type="spellEnd"/>
+      <w:r>
+        <w:t xml:space="preserve"> para que vayan disminuyendo en lugar de aumentando de tamaño (128-64-32), al igual que integrar un </w:t>
+      </w:r>
+      <w:proofErr w:type="spellStart"/>
+      <w:r>
+        <w:t>BatchNormalization</w:t>
+      </w:r>
+      <w:proofErr w:type="spellEnd"/>
+      <w:r>
+        <w:t xml:space="preserve"> después de las primeras dos capas.  </w:t>
       </w:r>
     </w:p>
     <w:p/>
@@ -3139,10 +3967,7 @@
           </w:tcPr>
           <w:p>
             <w:r>
-              <w:t>Resultados del modelo</w:t>
-            </w:r>
-            <w:r>
-              <w:t xml:space="preserve"> Original</w:t>
+              <w:t>Resultados del modelo Original</w:t>
             </w:r>
           </w:p>
         </w:tc>
@@ -3173,9 +3998,11 @@
             <w:tcW w:w="1317" w:type="dxa"/>
           </w:tcPr>
           <w:p>
+            <w:proofErr w:type="spellStart"/>
             <w:r>
               <w:t>Accuracy</w:t>
             </w:r>
+            <w:proofErr w:type="spellEnd"/>
           </w:p>
         </w:tc>
         <w:tc>
@@ -3266,9 +4093,11 @@
             <w:tcW w:w="1317" w:type="dxa"/>
           </w:tcPr>
           <w:p>
+            <w:proofErr w:type="spellStart"/>
             <w:r>
               <w:t>Precision</w:t>
             </w:r>
+            <w:proofErr w:type="spellEnd"/>
           </w:p>
         </w:tc>
         <w:tc>
@@ -3287,10 +4116,7 @@
           </w:tcPr>
           <w:p>
             <w:r>
-              <w:t>0</w:t>
-            </w:r>
-            <w:r>
-              <w:t>.8077</w:t>
+              <w:t>0.8077</w:t>
             </w:r>
           </w:p>
         </w:tc>
@@ -3562,9 +4388,11 @@
             <w:tcW w:w="1317" w:type="dxa"/>
           </w:tcPr>
           <w:p>
+            <w:proofErr w:type="spellStart"/>
             <w:r>
               <w:t>Accuracy</w:t>
             </w:r>
+            <w:proofErr w:type="spellEnd"/>
           </w:p>
         </w:tc>
         <w:tc>
@@ -3576,10 +4404,7 @@
               <w:t>71</w:t>
             </w:r>
             <w:r>
-              <w:t>.33</w:t>
-            </w:r>
-            <w:r>
-              <w:t>%</w:t>
+              <w:t>.33%</w:t>
             </w:r>
           </w:p>
         </w:tc>
@@ -3624,10 +4449,7 @@
           </w:tcPr>
           <w:p>
             <w:r>
-              <w:t>0</w:t>
-            </w:r>
-            <w:r>
-              <w:t>.96</w:t>
+              <w:t>0.96</w:t>
             </w:r>
           </w:p>
         </w:tc>
@@ -3638,9 +4460,11 @@
             <w:tcW w:w="1317" w:type="dxa"/>
           </w:tcPr>
           <w:p>
+            <w:proofErr w:type="spellStart"/>
             <w:r>
               <w:t>Precision</w:t>
             </w:r>
+            <w:proofErr w:type="spellEnd"/>
           </w:p>
         </w:tc>
         <w:tc>
@@ -3659,10 +4483,7 @@
           </w:tcPr>
           <w:p>
             <w:r>
-              <w:t>0.</w:t>
-            </w:r>
-            <w:r>
-              <w:t>93</w:t>
+              <w:t>0.93</w:t>
             </w:r>
           </w:p>
         </w:tc>
@@ -3671,21 +4492,29 @@
     <w:p/>
     <w:p>
       <w:r>
+        <w:t>La CNN Modificada, pese a tratar de crear la arquitectura en base a lo explicado en el artículo original los resultados fueron por debajo de lo esperado.</w:t>
+      </w:r>
+    </w:p>
+    <w:p/>
+    <w:p>
+      <w:r>
+        <w:t xml:space="preserve">Los resultados demuestran que las métricas están por encima del modelo CNN original que implementé, pero se encuentra un poco por debajo de la versión mejorada. Pese a esto, ninguno de los modelos ha obtenido resultados comparables con lo reportado en el artículo, por lo que los </w:t>
+      </w:r>
+      <w:proofErr w:type="spellStart"/>
+      <w:r>
+        <w:t>hiperparámetros</w:t>
+      </w:r>
+      <w:proofErr w:type="spellEnd"/>
+      <w:r>
+        <w:t xml:space="preserve"> y arquitectura siguen sin llegar a los resultados esperados.  </w:t>
+      </w:r>
+    </w:p>
+    <w:p>
+      <w:r>
+        <w:rPr>
+          <w:noProof/>
+        </w:rPr>
         <w:lastRenderedPageBreak/>
-        <w:t>La CNN Modificada, pese a tratar de crear la arquitectura en base a lo explicado en el artículo original los resultados fueron por debajo de lo esperado.</w:t>
-      </w:r>
-    </w:p>
-    <w:p/>
-    <w:p>
-      <w:r>
-        <w:t xml:space="preserve">Los resultados demuestran que las métricas están por encima del modelo CNN original que implementé, pero se encuentra un poco por debajo de la versión mejorada. Pese a esto, ninguno de los modelos ha obtenido resultados comparables con lo reportado en el artículo, por lo que los hiperparámetros y arquitectura siguen sin llegar a los resultados esperados.  </w:t>
-      </w:r>
-    </w:p>
-    <w:p>
-      <w:r>
-        <w:rPr>
-          <w:noProof/>
-        </w:rPr>
         <w:drawing>
           <wp:inline distT="0" distB="0" distL="0" distR="0" wp14:anchorId="6DB228B0" wp14:editId="66CFE750">
             <wp:extent cx="3061335" cy="2298065"/>
@@ -3855,14 +4684,12 @@
           <w:bCs/>
           <w:sz w:val="28"/>
           <w:szCs w:val="28"/>
-          <w:lang w:val="es-MX"/>
         </w:rPr>
       </w:pPr>
       <w:r>
         <w:rPr>
           <w:sz w:val="28"/>
           <w:szCs w:val="28"/>
-          <w:lang w:val="es-MX"/>
         </w:rPr>
         <w:t>REFERENCIAS</w:t>
       </w:r>
@@ -3881,7 +4708,25 @@
           <w:iCs/>
           <w:lang w:val="en-US"/>
         </w:rPr>
-        <w:t xml:space="preserve">Ahmed, M., Rozario, U., Kabir, M. M., Aung, Z., Shin, J., &amp; Mridha, M. F. (2024). Musical genre classification using advanced audio analysis and deep learning techniques. IEEE Open Journal of the Computer Society, 5, 457–467. </w:t>
+        <w:t xml:space="preserve">Ahmed, M., Rozario, U., Kabir, M. M., Aung, Z., Shin, J., &amp; </w:t>
+      </w:r>
+      <w:proofErr w:type="spellStart"/>
+      <w:r>
+        <w:rPr>
+          <w:rFonts w:ascii="Times" w:eastAsia="Times" w:hAnsi="Times" w:cs="Times"/>
+          <w:iCs/>
+          <w:lang w:val="en-US"/>
+        </w:rPr>
+        <w:t>Mridha</w:t>
+      </w:r>
+      <w:proofErr w:type="spellEnd"/>
+      <w:r>
+        <w:rPr>
+          <w:rFonts w:ascii="Times" w:eastAsia="Times" w:hAnsi="Times" w:cs="Times"/>
+          <w:iCs/>
+          <w:lang w:val="en-US"/>
+        </w:rPr>
+        <w:t xml:space="preserve">, M. F. (2024). Musical genre classification using advanced audio analysis and deep learning techniques. IEEE Open Journal of the Computer Society, 5, 457–467. </w:t>
       </w:r>
       <w:hyperlink r:id="rId22" w:history="1">
         <w:r>
@@ -3889,6 +4734,7 @@
             <w:rStyle w:val="Hipervnculo"/>
             <w:rFonts w:ascii="Times" w:eastAsia="Times" w:hAnsi="Times" w:cs="Times"/>
             <w:iCs/>
+            <w:lang w:val="en-US"/>
           </w:rPr>
           <w:t>https://doi.org/10.1109/OJCS.2024.3431229</w:t>
         </w:r>
@@ -3897,6 +4743,7 @@
         <w:rPr>
           <w:rFonts w:ascii="Times" w:eastAsia="Times" w:hAnsi="Times" w:cs="Times"/>
           <w:iCs/>
+          <w:lang w:val="en-US"/>
         </w:rPr>
         <w:t xml:space="preserve"> </w:t>
       </w:r>
@@ -3904,8 +4751,16 @@
         <w:rPr>
           <w:rFonts w:ascii="Times" w:eastAsia="Times" w:hAnsi="Times" w:cs="Times"/>
           <w:iCs/>
-        </w:rPr>
-        <w:t xml:space="preserve">. Recuperado de: </w:t>
+          <w:lang w:val="en-US"/>
+        </w:rPr>
+        <w:t xml:space="preserve">. </w:t>
+      </w:r>
+      <w:r>
+        <w:rPr>
+          <w:rFonts w:ascii="Times" w:eastAsia="Times" w:hAnsi="Times" w:cs="Times"/>
+          <w:iCs/>
+        </w:rPr>
+        <w:t xml:space="preserve">Recuperado de: </w:t>
       </w:r>
       <w:hyperlink r:id="rId23" w:history="1">
         <w:r>
@@ -3914,23 +4769,7 @@
             <w:rFonts w:ascii="Times" w:eastAsia="Times" w:hAnsi="Times" w:cs="Times"/>
             <w:iCs/>
           </w:rPr>
-          <w:t>https://ieeexplore.ieee.org/abstract/</w:t>
-        </w:r>
-        <w:r>
-          <w:rPr>
-            <w:rStyle w:val="Hipervnculo"/>
-            <w:rFonts w:ascii="Times" w:eastAsia="Times" w:hAnsi="Times" w:cs="Times"/>
-            <w:iCs/>
-          </w:rPr>
-          <w:t>d</w:t>
-        </w:r>
-        <w:r>
-          <w:rPr>
-            <w:rStyle w:val="Hipervnculo"/>
-            <w:rFonts w:ascii="Times" w:eastAsia="Times" w:hAnsi="Times" w:cs="Times"/>
-            <w:iCs/>
-          </w:rPr>
-          <w:t>ocument/10605044</w:t>
+          <w:t>https://ieeexplore.ieee.org/abstract/document/10605044</w:t>
         </w:r>
       </w:hyperlink>
       <w:r>
@@ -3958,20 +4797,50 @@
           <w:iCs/>
         </w:rPr>
       </w:pPr>
+      <w:r>
+        <w:rPr>
+          <w:rFonts w:ascii="Times" w:eastAsia="Times" w:hAnsi="Times" w:cs="Times"/>
+          <w:iCs/>
+        </w:rPr>
+        <w:t xml:space="preserve">TensorFlow. (s. f.). </w:t>
+      </w:r>
       <w:r>
         <w:rPr>
           <w:rFonts w:ascii="Times" w:eastAsia="Times" w:hAnsi="Times" w:cs="Times"/>
           <w:iCs/>
           <w:lang w:val="en-US"/>
         </w:rPr>
-        <w:t xml:space="preserve">TensorFlow. (s. f.). GTZAN: A dataset for music genre classification. </w:t>
+        <w:t xml:space="preserve">GTZAN: A dataset for music genre classification. </w:t>
       </w:r>
       <w:r>
         <w:rPr>
           <w:rFonts w:ascii="Times" w:eastAsia="Times" w:hAnsi="Times" w:cs="Times"/>
           <w:iCs/>
         </w:rPr>
-        <w:t xml:space="preserve">TensorFlow Datasets. Recuperado el 18 de octubre de 2026, de </w:t>
+        <w:t xml:space="preserve">TensorFlow </w:t>
+      </w:r>
+      <w:proofErr w:type="spellStart"/>
+      <w:r>
+        <w:rPr>
+          <w:rFonts w:ascii="Times" w:eastAsia="Times" w:hAnsi="Times" w:cs="Times"/>
+          <w:iCs/>
+        </w:rPr>
+        <w:t>Datasets</w:t>
+      </w:r>
+      <w:proofErr w:type="spellEnd"/>
+      <w:r>
+        <w:rPr>
+          <w:rFonts w:ascii="Times" w:eastAsia="Times" w:hAnsi="Times" w:cs="Times"/>
+          <w:iCs/>
+        </w:rPr>
+        <w:t xml:space="preserve">. Recuperado el 18 de </w:t>
+      </w:r>
+      <w:r>
+        <w:rPr>
+          <w:rFonts w:ascii="Times" w:eastAsia="Times" w:hAnsi="Times" w:cs="Times"/>
+          <w:iCs/>
+        </w:rPr>
+        <w:t xml:space="preserve">octubre de 2026, de </w:t>
       </w:r>
       <w:hyperlink r:id="rId24" w:history="1">
         <w:r>
@@ -4008,12 +4877,69 @@
           <w:iCs/>
         </w:rPr>
       </w:pPr>
+      <w:proofErr w:type="spellStart"/>
       <w:r>
         <w:rPr>
           <w:rFonts w:ascii="Times" w:eastAsia="Times" w:hAnsi="Times" w:cs="Times"/>
           <w:iCs/>
         </w:rPr>
-        <w:t xml:space="preserve">Lewtun. (s. f.). Music genres dataset [Conjunto de datos]. Hugging Face. Recuperado el 18 de octubre de 2026, de </w:t>
+        <w:t>Lewtun</w:t>
+      </w:r>
+      <w:proofErr w:type="spellEnd"/>
+      <w:r>
+        <w:rPr>
+          <w:rFonts w:ascii="Times" w:eastAsia="Times" w:hAnsi="Times" w:cs="Times"/>
+          <w:iCs/>
+        </w:rPr>
+        <w:t xml:space="preserve">. (s. f.). Music </w:t>
+      </w:r>
+      <w:proofErr w:type="spellStart"/>
+      <w:r>
+        <w:rPr>
+          <w:rFonts w:ascii="Times" w:eastAsia="Times" w:hAnsi="Times" w:cs="Times"/>
+          <w:iCs/>
+        </w:rPr>
+        <w:t>genres</w:t>
+      </w:r>
+      <w:proofErr w:type="spellEnd"/>
+      <w:r>
+        <w:rPr>
+          <w:rFonts w:ascii="Times" w:eastAsia="Times" w:hAnsi="Times" w:cs="Times"/>
+          <w:iCs/>
+        </w:rPr>
+        <w:t xml:space="preserve"> dataset [Conjunto de datos]. </w:t>
+      </w:r>
+      <w:proofErr w:type="spellStart"/>
+      <w:r>
+        <w:rPr>
+          <w:rFonts w:ascii="Times" w:eastAsia="Times" w:hAnsi="Times" w:cs="Times"/>
+          <w:iCs/>
+        </w:rPr>
+        <w:t>Hugging</w:t>
+      </w:r>
+      <w:proofErr w:type="spellEnd"/>
+      <w:r>
+        <w:rPr>
+          <w:rFonts w:ascii="Times" w:eastAsia="Times" w:hAnsi="Times" w:cs="Times"/>
+          <w:iCs/>
+        </w:rPr>
+        <w:t xml:space="preserve"> </w:t>
+      </w:r>
+      <w:proofErr w:type="spellStart"/>
+      <w:r>
+        <w:rPr>
+          <w:rFonts w:ascii="Times" w:eastAsia="Times" w:hAnsi="Times" w:cs="Times"/>
+          <w:iCs/>
+        </w:rPr>
+        <w:t>Face</w:t>
+      </w:r>
+      <w:proofErr w:type="spellEnd"/>
+      <w:r>
+        <w:rPr>
+          <w:rFonts w:ascii="Times" w:eastAsia="Times" w:hAnsi="Times" w:cs="Times"/>
+          <w:iCs/>
+        </w:rPr>
+        <w:t xml:space="preserve">. Recuperado el 18 de octubre de 2026, de </w:t>
       </w:r>
       <w:hyperlink r:id="rId25" w:history="1">
         <w:r>
@@ -4055,7 +4981,39 @@
           <w:rFonts w:ascii="Times" w:eastAsia="Times" w:hAnsi="Times" w:cs="Times"/>
           <w:iCs/>
         </w:rPr>
-        <w:t xml:space="preserve">Patel, S. J. (2026). Sunnify Spotify Downloader (Versión 2.5.0) [Software de computación]. GitHub. </w:t>
+        <w:t xml:space="preserve">Patel, S. J. (2026). </w:t>
+      </w:r>
+      <w:proofErr w:type="spellStart"/>
+      <w:r>
+        <w:rPr>
+          <w:rFonts w:ascii="Times" w:eastAsia="Times" w:hAnsi="Times" w:cs="Times"/>
+          <w:iCs/>
+        </w:rPr>
+        <w:t>Sunnify</w:t>
+      </w:r>
+      <w:proofErr w:type="spellEnd"/>
+      <w:r>
+        <w:rPr>
+          <w:rFonts w:ascii="Times" w:eastAsia="Times" w:hAnsi="Times" w:cs="Times"/>
+          <w:iCs/>
+        </w:rPr>
+        <w:t xml:space="preserve"> Spotify </w:t>
+      </w:r>
+      <w:proofErr w:type="spellStart"/>
+      <w:r>
+        <w:rPr>
+          <w:rFonts w:ascii="Times" w:eastAsia="Times" w:hAnsi="Times" w:cs="Times"/>
+          <w:iCs/>
+        </w:rPr>
+        <w:t>Downloader</w:t>
+      </w:r>
+      <w:proofErr w:type="spellEnd"/>
+      <w:r>
+        <w:rPr>
+          <w:rFonts w:ascii="Times" w:eastAsia="Times" w:hAnsi="Times" w:cs="Times"/>
+          <w:iCs/>
+        </w:rPr>
+        <w:t xml:space="preserve"> (Versión 2.5.0) [Software de computación]. GitHub. </w:t>
       </w:r>
       <w:hyperlink r:id="rId26" w:history="1">
         <w:r>
@@ -7252,28 +8210,28 @@
 </file>
 
 <file path=customXml/item1.xml><?xml version="1.0" encoding="utf-8"?>
-<b:Sources xmlns:b="http://schemas.openxmlformats.org/officeDocument/2006/bibliography" xmlns="http://schemas.openxmlformats.org/officeDocument/2006/bibliography" SelectedStyle="\APASixthEditionOfficeOnline.xsl" StyleName="APA" Version="6"/>
-</file>
-
-<file path=customXml/item2.xml><?xml version="1.0" encoding="utf-8"?>
 <go:gDocsCustomXmlDataStorage xmlns:go="http://customooxmlschemas.google.com/" xmlns:r="http://schemas.openxmlformats.org/officeDocument/2006/relationships">
   <go:docsCustomData xmlns:go="http://customooxmlschemas.google.com/" roundtripDataSignature="AMtx7mjPovk3igAzhESNbNe8yh+DWI7/jA==">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</go:docsCustomData>
 </go:gDocsCustomXmlDataStorage>
 </file>
 
-<file path=customXml/itemProps1.xml><?xml version="1.0" encoding="utf-8"?>
-<ds:datastoreItem xmlns:ds="http://schemas.openxmlformats.org/officeDocument/2006/customXml" ds:itemID="{7FDB3116-7FC6-4074-8BFD-613BFCEE0C0E}">
-  <ds:schemaRefs>
-    <ds:schemaRef ds:uri="http://schemas.openxmlformats.org/officeDocument/2006/bibliography"/>
-  </ds:schemaRefs>
-</ds:datastoreItem>
+<file path=customXml/item2.xml><?xml version="1.0" encoding="utf-8"?>
+<b:Sources xmlns:b="http://schemas.openxmlformats.org/officeDocument/2006/bibliography" xmlns="http://schemas.openxmlformats.org/officeDocument/2006/bibliography" SelectedStyle="\APASixthEditionOfficeOnline.xsl" StyleName="APA" Version="6"/>
 </file>
 
-<file path=customXml/itemProps2.xml><?xml version="1.0" encoding="utf-8"?>
+<file path=customXml/itemProps1.xml><?xml version="1.0" encoding="utf-8"?>
 <ds:datastoreItem xmlns:ds="http://schemas.openxmlformats.org/officeDocument/2006/customXml" ds:itemID="{11111111-1234-1234-1234-123412341234}">
   <ds:schemaRefs>
     <ds:schemaRef ds:uri="http://customooxmlschemas.google.com/"/>
     <ds:schemaRef ds:uri="http://schemas.openxmlformats.org/officeDocument/2006/relationships"/>
   </ds:schemaRefs>
 </ds:datastoreItem>
+</file>
+
+<file path=customXml/itemProps2.xml><?xml version="1.0" encoding="utf-8"?>
+<ds:datastoreItem xmlns:ds="http://schemas.openxmlformats.org/officeDocument/2006/customXml" ds:itemID="{7FDB3116-7FC6-4074-8BFD-613BFCEE0C0E}">
+  <ds:schemaRefs>
+    <ds:schemaRef ds:uri="http://schemas.openxmlformats.org/officeDocument/2006/bibliography"/>
+  </ds:schemaRefs>
+</ds:datastoreItem>
 </file>
</xml_diff>